<commit_message>
Sync docs and diagrams with weekday schedule and single deploy flow.
Update architecture, deploy, and ops docs for Mon-Fri 10:00-19:30 IST,
add draw.io sources, refresh AWS production diagram exports, and
regenerate ARCHITECTURE Word/PDF exports.

Co-authored-by: Cursor <cursoragent@cursor.com>
</commit_message>
<xml_diff>
--- a/docs/ARCHITECTURE.docx
+++ b/docs/ARCHITECTURE.docx
@@ -28,7 +28,7 @@
         </w:p>
       </w:sdtContent>
     </w:sdt>
-    <w:bookmarkStart w:id="66" w:name="interviewcoach-ai-architecture-document"/>
+    <w:bookmarkStart w:id="68" w:name="interviewcoach-ai-architecture-document"/>
     <w:p>
       <w:pPr>
         <w:pStyle w:val="Heading1"/>
@@ -498,7 +498,7 @@
         <w:pStyle w:val="BodyText"/>
       </w:pPr>
       <w:r>
-        <w:t xml:space="preserve">EC2 instances run</w:t>
+        <w:t xml:space="preserve">EC2 and RDS run</w:t>
       </w:r>
       <w:r>
         <w:t xml:space="preserve"> </w:t>
@@ -508,13 +508,25 @@
           <w:b/>
           <w:bCs/>
         </w:rPr>
-        <w:t xml:space="preserve">10:00–20:00 IST</w:t>
+        <w:t xml:space="preserve">Mon–Fri 10:00–19:30 IST</w:t>
       </w:r>
       <w:r>
         <w:t xml:space="preserve"> </w:t>
       </w:r>
       <w:r>
-        <w:t xml:space="preserve">daily. RDS may remain available 24/7.</w:t>
+        <w:t xml:space="preserve">only (weekends off). EventBridge schedules in</w:t>
+      </w:r>
+      <w:r>
+        <w:t xml:space="preserve"> </w:t>
+      </w:r>
+      <w:r>
+        <w:rPr>
+          <w:rStyle w:val="VerbatimChar"/>
+        </w:rPr>
+        <w:t xml:space="preserve">Asia/Kolkata</w:t>
+      </w:r>
+      <w:r>
+        <w:t xml:space="preserve">.</w:t>
       </w:r>
     </w:p>
     <w:p>
@@ -1356,7 +1368,7 @@
         <w:rPr>
           <w:rStyle w:val="VerbatimChar"/>
         </w:rPr>
-        <w:t xml:space="preserve">│  EventBridge + Lambda: EC2/RDS stop-start 10:00–20:00 IST                    │</w:t>
+        <w:t xml:space="preserve">│  EventBridge + Lambda: EC2/RDS Mon–Fri 10:00–19:30 IST; weekends off         │</w:t>
       </w:r>
       <w:r>
         <w:br/>
@@ -2392,7 +2404,7 @@
               <w:pStyle w:val="Compact"/>
             </w:pPr>
             <w:r>
-              <w:t xml:space="preserve">10:00–20:00 IST (scheduled)</w:t>
+              <w:t xml:space="preserve">Mon–Fri 10:00–19:30 IST (scheduled); off Sat–Sun</w:t>
             </w:r>
           </w:p>
         </w:tc>
@@ -2644,7 +2656,7 @@
         <w:rPr>
           <w:rStyle w:val="VerbatimChar"/>
         </w:rPr>
-        <w:t xml:space="preserve">Security workflow (lint, build, pytest, SAST, dependency scans)</w:t>
+        <w:t xml:space="preserve">Security · PR quick check (lint / pytest / gitleaks on changed files)</w:t>
       </w:r>
       <w:r>
         <w:br/>
@@ -2698,7 +2710,7 @@
         <w:rPr>
           <w:rStyle w:val="VerbatimChar"/>
         </w:rPr>
-        <w:t xml:space="preserve">Deploy · Auto (develop) → Quality gate</w:t>
+        <w:t xml:space="preserve">Deploy · Production (single workflow run — no separate dispatcher)</w:t>
       </w:r>
       <w:r>
         <w:br/>
@@ -2716,7 +2728,7 @@
         <w:rPr>
           <w:rStyle w:val="VerbatimChar"/>
         </w:rPr>
-        <w:t xml:space="preserve">    ▼</w:t>
+        <w:t xml:space="preserve">    ├─ Resolve context + authorize merge</w:t>
       </w:r>
       <w:r>
         <w:br/>
@@ -2725,7 +2737,7 @@
         <w:rPr>
           <w:rStyle w:val="VerbatimChar"/>
         </w:rPr>
-        <w:t xml:space="preserve">Deploy · Production (admin approves production environment)</w:t>
+        <w:t xml:space="preserve">    ├─ Admin approves production environment</w:t>
       </w:r>
       <w:r>
         <w:br/>
@@ -2771,6 +2783,18 @@
           <w:rStyle w:val="VerbatimChar"/>
         </w:rPr>
         <w:t xml:space="preserve">    └── RDS: psql migrations (if database/** changed)</w:t>
+      </w:r>
+      <w:r>
+        <w:br/>
+      </w:r>
+      <w:r>
+        <w:br/>
+      </w:r>
+      <w:r>
+        <w:rPr>
+          <w:rStyle w:val="VerbatimChar"/>
+        </w:rPr>
+        <w:t xml:space="preserve">Weekly (Mon) or manual: full Security scan (CodeQL, Trivy, Semgrep, e2e, audits).</w:t>
       </w:r>
     </w:p>
     <w:p>
@@ -8060,7 +8084,38 @@
         </w:numPr>
       </w:pPr>
       <w:r>
-        <w:t xml:space="preserve">GitHub Actions runs quality gate (lint, build, pytest, merge-conflict check).</w:t>
+        <w:t xml:space="preserve">Merge to</w:t>
+      </w:r>
+      <w:r>
+        <w:t xml:space="preserve"> </w:t>
+      </w:r>
+      <w:r>
+        <w:rPr>
+          <w:rStyle w:val="VerbatimChar"/>
+        </w:rPr>
+        <w:t xml:space="preserve">develop</w:t>
+      </w:r>
+      <w:r>
+        <w:t xml:space="preserve"> </w:t>
+      </w:r>
+      <w:r>
+        <w:t xml:space="preserve">triggers</w:t>
+      </w:r>
+      <w:r>
+        <w:t xml:space="preserve"> </w:t>
+      </w:r>
+      <w:r>
+        <w:rPr>
+          <w:b/>
+          <w:bCs/>
+        </w:rPr>
+        <w:t xml:space="preserve">Deploy · Production</w:t>
+      </w:r>
+      <w:r>
+        <w:t xml:space="preserve"> </w:t>
+      </w:r>
+      <w:r>
+        <w:t xml:space="preserve">(PR quick check already ran on the PR).</w:t>
       </w:r>
     </w:p>
     <w:p>
@@ -8087,7 +8142,7 @@
         <w:t xml:space="preserve"> </w:t>
       </w:r>
       <w:r>
-        <w:t xml:space="preserve">environment.</w:t>
+        <w:t xml:space="preserve">environment in that same workflow run.</w:t>
       </w:r>
     </w:p>
     <w:p>
@@ -8903,13 +8958,14 @@
     <w:tbl>
       <w:tblPr>
         <w:tblStyle w:val="Table"/>
-        <w:tblW w:type="auto" w:w="0"/>
+        <w:tblW w:type="pct" w:w="5000"/>
+        <w:tblLayout w:type="fixed"/>
         <w:tblLook w:firstRow="1" w:lastRow="0" w:firstColumn="0" w:lastColumn="0" w:noHBand="0" w:noVBand="0" w:val="0020"/>
       </w:tblPr>
       <w:tblGrid>
-        <w:gridCol w:w="2640"/>
-        <w:gridCol w:w="2640"/>
-        <w:gridCol w:w="2640"/>
+        <w:gridCol w:w="2292"/>
+        <w:gridCol w:w="3960"/>
+        <w:gridCol w:w="1667"/>
       </w:tblGrid>
       <w:tr>
         <w:trPr>
@@ -9197,29 +9253,29 @@
               <w:pStyle w:val="Compact"/>
             </w:pPr>
             <w:r>
-              <w:t xml:space="preserve">EC2 schedule</w:t>
-            </w:r>
-          </w:p>
-        </w:tc>
-        <w:tc>
-          <w:tcPr/>
-          <w:p>
-            <w:pPr>
-              <w:pStyle w:val="Compact"/>
-            </w:pPr>
-            <w:r>
-              <w:t xml:space="preserve">10:00–20:00 IST</w:t>
-            </w:r>
-          </w:p>
-        </w:tc>
-        <w:tc>
-          <w:tcPr/>
-          <w:p>
-            <w:pPr>
-              <w:pStyle w:val="Compact"/>
-            </w:pPr>
-            <w:r>
-              <w:t xml:space="preserve">Cost optimization</w:t>
+              <w:t xml:space="preserve">EC2/RDS schedule</w:t>
+            </w:r>
+          </w:p>
+        </w:tc>
+        <w:tc>
+          <w:tcPr/>
+          <w:p>
+            <w:pPr>
+              <w:pStyle w:val="Compact"/>
+            </w:pPr>
+            <w:r>
+              <w:t xml:space="preserve">Mon–Fri 10:00–19:30 IST</w:t>
+            </w:r>
+          </w:p>
+        </w:tc>
+        <w:tc>
+          <w:tcPr/>
+          <w:p>
+            <w:pPr>
+              <w:pStyle w:val="Compact"/>
+            </w:pPr>
+            <w:r>
+              <w:t xml:space="preserve">Cost optimization; weekends off</w:t>
             </w:r>
           </w:p>
         </w:tc>
@@ -9408,7 +9464,7 @@
     </w:p>
     <w:bookmarkEnd w:id="55"/>
     <w:bookmarkEnd w:id="56"/>
-    <w:bookmarkStart w:id="65" w:name="appendix"/>
+    <w:bookmarkStart w:id="67" w:name="appendix"/>
     <w:p>
       <w:pPr>
         <w:pStyle w:val="Heading2"/>
@@ -9417,13 +9473,13 @@
         <w:t xml:space="preserve">4. Appendix</w:t>
       </w:r>
     </w:p>
-    <w:bookmarkStart w:id="61" w:name="diagram-files"/>
+    <w:bookmarkStart w:id="63" w:name="diagram-files-professional-aws-icons"/>
     <w:p>
       <w:pPr>
         <w:pStyle w:val="Heading3"/>
       </w:pPr>
       <w:r>
-        <w:t xml:space="preserve">4.1 Diagram files</w:t>
+        <w:t xml:space="preserve">4.1 Diagram files (professional AWS icons)</w:t>
       </w:r>
     </w:p>
     <w:tbl>
@@ -9487,6 +9543,58 @@
               <w:r>
                 <w:rPr>
                   <w:rStyle w:val="Hyperlink"/>
+                  <w:b/>
+                  <w:bCs/>
+                </w:rPr>
+                <w:t xml:space="preserve">docs/diagrams/interviewcoach-aws-production.drawio</w:t>
+              </w:r>
+            </w:hyperlink>
+          </w:p>
+        </w:tc>
+        <w:tc>
+          <w:tcPr/>
+          <w:p>
+            <w:pPr>
+              <w:pStyle w:val="Compact"/>
+            </w:pPr>
+            <w:r>
+              <w:t xml:space="preserve">draw.io</w:t>
+            </w:r>
+          </w:p>
+        </w:tc>
+        <w:tc>
+          <w:tcPr/>
+          <w:p>
+            <w:pPr>
+              <w:pStyle w:val="Compact"/>
+            </w:pPr>
+            <w:r>
+              <w:rPr>
+                <w:b/>
+                <w:bCs/>
+              </w:rPr>
+              <w:t xml:space="preserve">Recommended</w:t>
+            </w:r>
+            <w:r>
+              <w:t xml:space="preserve"> </w:t>
+            </w:r>
+            <w:r>
+              <w:t xml:space="preserve">— 3 tabs with AWS official icons</w:t>
+            </w:r>
+          </w:p>
+        </w:tc>
+      </w:tr>
+      <w:tr>
+        <w:tc>
+          <w:tcPr/>
+          <w:p>
+            <w:pPr>
+              <w:pStyle w:val="Compact"/>
+            </w:pPr>
+            <w:hyperlink r:id="rId58">
+              <w:r>
+                <w:rPr>
+                  <w:rStyle w:val="Hyperlink"/>
                 </w:rPr>
                 <w:t xml:space="preserve">docs/diagrams/interviewcoach-architecture.drawio</w:t>
               </w:r>
@@ -9511,19 +9619,19 @@
               <w:pStyle w:val="Compact"/>
             </w:pPr>
             <w:r>
-              <w:t xml:space="preserve">AWS VPC deployment diagram</w:t>
-            </w:r>
-          </w:p>
-        </w:tc>
-      </w:tr>
-      <w:tr>
-        <w:tc>
-          <w:tcPr/>
-          <w:p>
-            <w:pPr>
-              <w:pStyle w:val="Compact"/>
-            </w:pPr>
-            <w:hyperlink r:id="rId58">
+              <w:t xml:space="preserve">AWS VPC deployment (basic)</w:t>
+            </w:r>
+          </w:p>
+        </w:tc>
+      </w:tr>
+      <w:tr>
+        <w:tc>
+          <w:tcPr/>
+          <w:p>
+            <w:pPr>
+              <w:pStyle w:val="Compact"/>
+            </w:pPr>
+            <w:hyperlink r:id="rId59">
               <w:r>
                 <w:rPr>
                   <w:rStyle w:val="Hyperlink"/>
@@ -9563,7 +9671,7 @@
             <w:pPr>
               <w:pStyle w:val="Compact"/>
             </w:pPr>
-            <w:hyperlink r:id="rId59">
+            <w:hyperlink r:id="rId60">
               <w:r>
                 <w:rPr>
                   <w:rStyle w:val="Hyperlink"/>
@@ -9603,7 +9711,7 @@
             <w:pPr>
               <w:pStyle w:val="Compact"/>
             </w:pPr>
-            <w:hyperlink r:id="rId60">
+            <w:hyperlink r:id="rId61">
               <w:r>
                 <w:rPr>
                   <w:rStyle w:val="Hyperlink"/>
@@ -9636,19 +9744,878 @@
           </w:p>
         </w:tc>
       </w:tr>
+      <w:tr>
+        <w:tc>
+          <w:tcPr/>
+          <w:p>
+            <w:pPr>
+              <w:pStyle w:val="Compact"/>
+            </w:pPr>
+            <w:hyperlink r:id="rId62">
+              <w:r>
+                <w:rPr>
+                  <w:rStyle w:val="Hyperlink"/>
+                </w:rPr>
+                <w:t xml:space="preserve">docs/ARCHITECTURE.html</w:t>
+              </w:r>
+            </w:hyperlink>
+          </w:p>
+        </w:tc>
+        <w:tc>
+          <w:tcPr/>
+          <w:p>
+            <w:pPr>
+              <w:pStyle w:val="Compact"/>
+            </w:pPr>
+            <w:r>
+              <w:t xml:space="preserve">HTML</w:t>
+            </w:r>
+          </w:p>
+        </w:tc>
+        <w:tc>
+          <w:tcPr/>
+          <w:p>
+            <w:pPr>
+              <w:pStyle w:val="Compact"/>
+            </w:pPr>
+            <w:r>
+              <w:t xml:space="preserve">Print-ready source used for PDF</w:t>
+            </w:r>
+          </w:p>
+        </w:tc>
+      </w:tr>
     </w:tbl>
     <w:p>
       <w:pPr>
         <w:pStyle w:val="BodyText"/>
       </w:pPr>
       <w:r>
-        <w:t xml:space="preserve">Open</w:t>
-      </w:r>
-      <w:r>
+        <w:rPr>
+          <w:rStyle w:val="VerbatimChar"/>
+          <w:b/>
+          <w:bCs/>
+        </w:rPr>
+        <w:t xml:space="preserve">interviewcoach-aws-production.drawio</w:t>
+      </w:r>
+      <w:r>
+        <w:rPr>
+          <w:b/>
+          <w:bCs/>
+        </w:rPr>
         <w:t xml:space="preserve"> </w:t>
       </w:r>
       <w:r>
         <w:rPr>
+          <w:b/>
+          <w:bCs/>
+        </w:rPr>
+        <w:t xml:space="preserve">contains 3 pages:</w:t>
+      </w:r>
+    </w:p>
+    <w:tbl>
+      <w:tblPr>
+        <w:tblStyle w:val="Table"/>
+        <w:tblW w:type="pct" w:w="5000"/>
+        <w:tblLayout w:type="fixed"/>
+        <w:tblLook w:firstRow="1" w:lastRow="0" w:firstColumn="0" w:lastColumn="0" w:noHBand="0" w:noVBand="0" w:val="0020"/>
+      </w:tblPr>
+      <w:tblGrid>
+        <w:gridCol w:w="2640"/>
+        <w:gridCol w:w="5280"/>
+      </w:tblGrid>
+      <w:tr>
+        <w:trPr>
+          <w:tblHeader w:val="on"/>
+        </w:trPr>
+        <w:tc>
+          <w:tcPr/>
+          <w:p>
+            <w:pPr>
+              <w:pStyle w:val="Compact"/>
+            </w:pPr>
+            <w:r>
+              <w:t xml:space="preserve">Tab</w:t>
+            </w:r>
+          </w:p>
+        </w:tc>
+        <w:tc>
+          <w:tcPr/>
+          <w:p>
+            <w:pPr>
+              <w:pStyle w:val="Compact"/>
+            </w:pPr>
+            <w:r>
+              <w:t xml:space="preserve">Contents</w:t>
+            </w:r>
+          </w:p>
+        </w:tc>
+      </w:tr>
+      <w:tr>
+        <w:tc>
+          <w:tcPr/>
+          <w:p>
+            <w:pPr>
+              <w:pStyle w:val="Compact"/>
+            </w:pPr>
+            <w:r>
+              <w:rPr>
+                <w:b/>
+                <w:bCs/>
+              </w:rPr>
+              <w:t xml:space="preserve">1. AWS Production (Icons)</w:t>
+            </w:r>
+          </w:p>
+        </w:tc>
+        <w:tc>
+          <w:tcPr/>
+          <w:p>
+            <w:pPr>
+              <w:pStyle w:val="Compact"/>
+            </w:pPr>
+            <w:r>
+              <w:t xml:space="preserve">EC2, RDS, Secrets Manager, EBS, Security Groups, IGW, VPC, Lambda, EventBridge — with ports and IPs</w:t>
+            </w:r>
+          </w:p>
+        </w:tc>
+      </w:tr>
+      <w:tr>
+        <w:tc>
+          <w:tcPr/>
+          <w:p>
+            <w:pPr>
+              <w:pStyle w:val="Compact"/>
+            </w:pPr>
+            <w:r>
+              <w:rPr>
+                <w:b/>
+                <w:bCs/>
+              </w:rPr>
+              <w:t xml:space="preserve">2. Page-to-Page Flow</w:t>
+            </w:r>
+          </w:p>
+        </w:tc>
+        <w:tc>
+          <w:tcPr/>
+          <w:p>
+            <w:pPr>
+              <w:pStyle w:val="Compact"/>
+            </w:pPr>
+            <w:r>
+              <w:t xml:space="preserve">React routes (Landing → Login → Interview → Feedback) linked to backend services</w:t>
+            </w:r>
+          </w:p>
+        </w:tc>
+      </w:tr>
+      <w:tr>
+        <w:tc>
+          <w:tcPr/>
+          <w:p>
+            <w:pPr>
+              <w:pStyle w:val="Compact"/>
+            </w:pPr>
+            <w:r>
+              <w:rPr>
+                <w:b/>
+                <w:bCs/>
+              </w:rPr>
+              <w:t xml:space="preserve">3. Request Data Flow</w:t>
+            </w:r>
+          </w:p>
+        </w:tc>
+        <w:tc>
+          <w:tcPr/>
+          <w:p>
+            <w:pPr>
+              <w:pStyle w:val="Compact"/>
+            </w:pPr>
+            <w:r>
+              <w:t xml:space="preserve">Live AI turn: Browser → nginx → API → RDS / Ollama / Whisper</w:t>
+            </w:r>
+          </w:p>
+        </w:tc>
+      </w:tr>
+    </w:tbl>
+    <w:p>
+      <w:pPr>
+        <w:pStyle w:val="BodyText"/>
+      </w:pPr>
+      <w:r>
+        <w:rPr>
+          <w:b/>
+          <w:bCs/>
+        </w:rPr>
+        <w:t xml:space="preserve">How to open (draw.io / diagrams.net):</w:t>
+      </w:r>
+    </w:p>
+    <w:p>
+      <w:pPr>
+        <w:pStyle w:val="Compact"/>
+        <w:numPr>
+          <w:ilvl w:val="0"/>
+          <w:numId w:val="1008"/>
+        </w:numPr>
+      </w:pPr>
+      <w:r>
+        <w:t xml:space="preserve">Go to https://app.diagrams.net →</w:t>
+      </w:r>
+      <w:r>
+        <w:t xml:space="preserve"> </w:t>
+      </w:r>
+      <w:r>
+        <w:rPr>
+          <w:b/>
+          <w:bCs/>
+        </w:rPr>
+        <w:t xml:space="preserve">Open Existing Diagram</w:t>
+      </w:r>
+    </w:p>
+    <w:p>
+      <w:pPr>
+        <w:pStyle w:val="Compact"/>
+        <w:numPr>
+          <w:ilvl w:val="0"/>
+          <w:numId w:val="1008"/>
+        </w:numPr>
+      </w:pPr>
+      <w:r>
+        <w:t xml:space="preserve">Select</w:t>
+      </w:r>
+      <w:r>
+        <w:t xml:space="preserve"> </w:t>
+      </w:r>
+      <w:r>
+        <w:rPr>
+          <w:rStyle w:val="VerbatimChar"/>
+        </w:rPr>
+        <w:t xml:space="preserve">docs/diagrams/interviewcoach-aws-production.drawio</w:t>
+      </w:r>
+    </w:p>
+    <w:p>
+      <w:pPr>
+        <w:pStyle w:val="Compact"/>
+        <w:numPr>
+          <w:ilvl w:val="0"/>
+          <w:numId w:val="1008"/>
+        </w:numPr>
+      </w:pPr>
+      <w:r>
+        <w:t xml:space="preserve">If icons look like boxes:</w:t>
+      </w:r>
+      <w:r>
+        <w:t xml:space="preserve"> </w:t>
+      </w:r>
+      <w:r>
+        <w:rPr>
+          <w:b/>
+          <w:bCs/>
+        </w:rPr>
+        <w:t xml:space="preserve">More Shapes</w:t>
+      </w:r>
+      <w:r>
+        <w:t xml:space="preserve"> </w:t>
+      </w:r>
+      <w:r>
+        <w:t xml:space="preserve">(bottom left) → enable</w:t>
+      </w:r>
+      <w:r>
+        <w:t xml:space="preserve"> </w:t>
+      </w:r>
+      <w:r>
+        <w:rPr>
+          <w:b/>
+          <w:bCs/>
+        </w:rPr>
+        <w:t xml:space="preserve">AWS19</w:t>
+      </w:r>
+      <w:r>
+        <w:t xml:space="preserve"> </w:t>
+      </w:r>
+      <w:r>
+        <w:t xml:space="preserve">or</w:t>
+      </w:r>
+      <w:r>
+        <w:t xml:space="preserve"> </w:t>
+      </w:r>
+      <w:r>
+        <w:rPr>
+          <w:b/>
+          <w:bCs/>
+        </w:rPr>
+        <w:t xml:space="preserve">AWS 2024</w:t>
+      </w:r>
+    </w:p>
+    <w:p>
+      <w:pPr>
+        <w:pStyle w:val="Compact"/>
+        <w:numPr>
+          <w:ilvl w:val="0"/>
+          <w:numId w:val="1008"/>
+        </w:numPr>
+      </w:pPr>
+      <w:r>
+        <w:t xml:space="preserve">Switch tabs at the bottom:</w:t>
+      </w:r>
+      <w:r>
+        <w:t xml:space="preserve"> </w:t>
+      </w:r>
+      <w:r>
+        <w:rPr>
+          <w:i/>
+          <w:iCs/>
+        </w:rPr>
+        <w:t xml:space="preserve">AWS Production</w:t>
+      </w:r>
+      <w:r>
+        <w:t xml:space="preserve"> </w:t>
+      </w:r>
+      <w:r>
+        <w:t xml:space="preserve">·</w:t>
+      </w:r>
+      <w:r>
+        <w:t xml:space="preserve"> </w:t>
+      </w:r>
+      <w:r>
+        <w:rPr>
+          <w:i/>
+          <w:iCs/>
+        </w:rPr>
+        <w:t xml:space="preserve">Page-to-Page Flow</w:t>
+      </w:r>
+      <w:r>
+        <w:t xml:space="preserve"> </w:t>
+      </w:r>
+      <w:r>
+        <w:t xml:space="preserve">·</w:t>
+      </w:r>
+      <w:r>
+        <w:t xml:space="preserve"> </w:t>
+      </w:r>
+      <w:r>
+        <w:rPr>
+          <w:i/>
+          <w:iCs/>
+        </w:rPr>
+        <w:t xml:space="preserve">Request Data Flow</w:t>
+      </w:r>
+    </w:p>
+    <w:p>
+      <w:pPr>
+        <w:pStyle w:val="Compact"/>
+        <w:numPr>
+          <w:ilvl w:val="0"/>
+          <w:numId w:val="1008"/>
+        </w:numPr>
+      </w:pPr>
+      <w:r>
+        <w:t xml:space="preserve">Export:</w:t>
+      </w:r>
+      <w:r>
+        <w:t xml:space="preserve"> </w:t>
+      </w:r>
+      <w:r>
+        <w:rPr>
+          <w:b/>
+          <w:bCs/>
+        </w:rPr>
+        <w:t xml:space="preserve">File → Export as → PNG / PDF / SVG</w:t>
+      </w:r>
+      <w:r>
+        <w:t xml:space="preserve"> </w:t>
+      </w:r>
+      <w:r>
+        <w:t xml:space="preserve">for slides or Confluence</w:t>
+      </w:r>
+    </w:p>
+    <w:p>
+      <w:pPr>
+        <w:pStyle w:val="FirstParagraph"/>
+      </w:pPr>
+      <w:r>
+        <w:rPr>
+          <w:b/>
+          <w:bCs/>
+        </w:rPr>
+        <w:t xml:space="preserve">Icon legend (AWS Architecture Style):</w:t>
+      </w:r>
+    </w:p>
+    <w:tbl>
+      <w:tblPr>
+        <w:tblStyle w:val="Table"/>
+        <w:tblW w:type="pct" w:w="5000"/>
+        <w:tblLayout w:type="fixed"/>
+        <w:tblLook w:firstRow="1" w:lastRow="0" w:firstColumn="0" w:lastColumn="0" w:noHBand="0" w:noVBand="0" w:val="0020"/>
+      </w:tblPr>
+      <w:tblGrid>
+        <w:gridCol w:w="1900"/>
+        <w:gridCol w:w="2851"/>
+        <w:gridCol w:w="3168"/>
+      </w:tblGrid>
+      <w:tr>
+        <w:trPr>
+          <w:tblHeader w:val="on"/>
+        </w:trPr>
+        <w:tc>
+          <w:tcPr/>
+          <w:p>
+            <w:pPr>
+              <w:pStyle w:val="Compact"/>
+            </w:pPr>
+            <w:r>
+              <w:t xml:space="preserve">Icon</w:t>
+            </w:r>
+          </w:p>
+        </w:tc>
+        <w:tc>
+          <w:tcPr/>
+          <w:p>
+            <w:pPr>
+              <w:pStyle w:val="Compact"/>
+            </w:pPr>
+            <w:r>
+              <w:t xml:space="preserve">Service</w:t>
+            </w:r>
+          </w:p>
+        </w:tc>
+        <w:tc>
+          <w:tcPr/>
+          <w:p>
+            <w:pPr>
+              <w:pStyle w:val="Compact"/>
+            </w:pPr>
+            <w:r>
+              <w:t xml:space="preserve">Used for</w:t>
+            </w:r>
+          </w:p>
+        </w:tc>
+      </w:tr>
+      <w:tr>
+        <w:tc>
+          <w:tcPr/>
+          <w:p>
+            <w:pPr>
+              <w:pStyle w:val="Compact"/>
+            </w:pPr>
+            <w:r>
+              <w:t xml:space="preserve">Orange server</w:t>
+            </w:r>
+          </w:p>
+        </w:tc>
+        <w:tc>
+          <w:tcPr/>
+          <w:p>
+            <w:pPr>
+              <w:pStyle w:val="Compact"/>
+            </w:pPr>
+            <w:r>
+              <w:rPr>
+                <w:b/>
+                <w:bCs/>
+              </w:rPr>
+              <w:t xml:space="preserve">EC2</w:t>
+            </w:r>
+          </w:p>
+        </w:tc>
+        <w:tc>
+          <w:tcPr/>
+          <w:p>
+            <w:pPr>
+              <w:pStyle w:val="Compact"/>
+            </w:pPr>
+            <w:r>
+              <w:t xml:space="preserve">Frontend, API, AI hosts</w:t>
+            </w:r>
+          </w:p>
+        </w:tc>
+      </w:tr>
+      <w:tr>
+        <w:tc>
+          <w:tcPr/>
+          <w:p>
+            <w:pPr>
+              <w:pStyle w:val="Compact"/>
+            </w:pPr>
+            <w:r>
+              <w:t xml:space="preserve">Purple cylinder</w:t>
+            </w:r>
+          </w:p>
+        </w:tc>
+        <w:tc>
+          <w:tcPr/>
+          <w:p>
+            <w:pPr>
+              <w:pStyle w:val="Compact"/>
+            </w:pPr>
+            <w:r>
+              <w:rPr>
+                <w:b/>
+                <w:bCs/>
+              </w:rPr>
+              <w:t xml:space="preserve">RDS</w:t>
+            </w:r>
+          </w:p>
+        </w:tc>
+        <w:tc>
+          <w:tcPr/>
+          <w:p>
+            <w:pPr>
+              <w:pStyle w:val="Compact"/>
+            </w:pPr>
+            <w:r>
+              <w:t xml:space="preserve">PostgreSQL database</w:t>
+            </w:r>
+          </w:p>
+        </w:tc>
+      </w:tr>
+      <w:tr>
+        <w:tc>
+          <w:tcPr/>
+          <w:p>
+            <w:pPr>
+              <w:pStyle w:val="Compact"/>
+            </w:pPr>
+            <w:r>
+              <w:t xml:space="preserve">Green key</w:t>
+            </w:r>
+          </w:p>
+        </w:tc>
+        <w:tc>
+          <w:tcPr/>
+          <w:p>
+            <w:pPr>
+              <w:pStyle w:val="Compact"/>
+            </w:pPr>
+            <w:r>
+              <w:rPr>
+                <w:b/>
+                <w:bCs/>
+              </w:rPr>
+              <w:t xml:space="preserve">Secrets Manager</w:t>
+            </w:r>
+          </w:p>
+        </w:tc>
+        <w:tc>
+          <w:tcPr/>
+          <w:p>
+            <w:pPr>
+              <w:pStyle w:val="Compact"/>
+            </w:pPr>
+            <w:r>
+              <w:rPr>
+                <w:rStyle w:val="VerbatimChar"/>
+              </w:rPr>
+              <w:t xml:space="preserve">interviewcoach/prod/app</w:t>
+            </w:r>
+            <w:r>
+              <w:t xml:space="preserve"> </w:t>
+            </w:r>
+            <w:r>
+              <w:t xml:space="preserve">config</w:t>
+            </w:r>
+          </w:p>
+        </w:tc>
+      </w:tr>
+      <w:tr>
+        <w:tc>
+          <w:tcPr/>
+          <w:p>
+            <w:pPr>
+              <w:pStyle w:val="Compact"/>
+            </w:pPr>
+            <w:r>
+              <w:t xml:space="preserve">Green disk</w:t>
+            </w:r>
+          </w:p>
+        </w:tc>
+        <w:tc>
+          <w:tcPr/>
+          <w:p>
+            <w:pPr>
+              <w:pStyle w:val="Compact"/>
+            </w:pPr>
+            <w:r>
+              <w:rPr>
+                <w:b/>
+                <w:bCs/>
+              </w:rPr>
+              <w:t xml:space="preserve">EBS Volume</w:t>
+            </w:r>
+          </w:p>
+        </w:tc>
+        <w:tc>
+          <w:tcPr/>
+          <w:p>
+            <w:pPr>
+              <w:pStyle w:val="Compact"/>
+            </w:pPr>
+            <w:r>
+              <w:rPr>
+                <w:rStyle w:val="VerbatimChar"/>
+              </w:rPr>
+              <w:t xml:space="preserve">/apps/storage</w:t>
+            </w:r>
+            <w:r>
+              <w:t xml:space="preserve"> </w:t>
+            </w:r>
+            <w:r>
+              <w:t xml:space="preserve">(files — S3 not used today)</w:t>
+            </w:r>
+          </w:p>
+        </w:tc>
+      </w:tr>
+      <w:tr>
+        <w:tc>
+          <w:tcPr/>
+          <w:p>
+            <w:pPr>
+              <w:pStyle w:val="Compact"/>
+            </w:pPr>
+            <w:r>
+              <w:t xml:space="preserve">Red shield</w:t>
+            </w:r>
+          </w:p>
+        </w:tc>
+        <w:tc>
+          <w:tcPr/>
+          <w:p>
+            <w:pPr>
+              <w:pStyle w:val="Compact"/>
+            </w:pPr>
+            <w:r>
+              <w:rPr>
+                <w:b/>
+                <w:bCs/>
+              </w:rPr>
+              <w:t xml:space="preserve">Security Group</w:t>
+            </w:r>
+          </w:p>
+        </w:tc>
+        <w:tc>
+          <w:tcPr/>
+          <w:p>
+            <w:pPr>
+              <w:pStyle w:val="Compact"/>
+            </w:pPr>
+            <w:r>
+              <w:t xml:space="preserve">Firewall rules per tier</w:t>
+            </w:r>
+          </w:p>
+        </w:tc>
+      </w:tr>
+      <w:tr>
+        <w:tc>
+          <w:tcPr/>
+          <w:p>
+            <w:pPr>
+              <w:pStyle w:val="Compact"/>
+            </w:pPr>
+            <w:r>
+              <w:t xml:space="preserve">Orange arch</w:t>
+            </w:r>
+          </w:p>
+        </w:tc>
+        <w:tc>
+          <w:tcPr/>
+          <w:p>
+            <w:pPr>
+              <w:pStyle w:val="Compact"/>
+            </w:pPr>
+            <w:r>
+              <w:rPr>
+                <w:b/>
+                <w:bCs/>
+              </w:rPr>
+              <w:t xml:space="preserve">Internet Gateway</w:t>
+            </w:r>
+          </w:p>
+        </w:tc>
+        <w:tc>
+          <w:tcPr/>
+          <w:p>
+            <w:pPr>
+              <w:pStyle w:val="Compact"/>
+            </w:pPr>
+            <w:r>
+              <w:t xml:space="preserve">Public internet entry</w:t>
+            </w:r>
+          </w:p>
+        </w:tc>
+      </w:tr>
+      <w:tr>
+        <w:tc>
+          <w:tcPr/>
+          <w:p>
+            <w:pPr>
+              <w:pStyle w:val="Compact"/>
+            </w:pPr>
+            <w:r>
+              <w:t xml:space="preserve">Green VPC box</w:t>
+            </w:r>
+          </w:p>
+        </w:tc>
+        <w:tc>
+          <w:tcPr/>
+          <w:p>
+            <w:pPr>
+              <w:pStyle w:val="Compact"/>
+            </w:pPr>
+            <w:r>
+              <w:rPr>
+                <w:b/>
+                <w:bCs/>
+              </w:rPr>
+              <w:t xml:space="preserve">VPC / Subnet</w:t>
+            </w:r>
+          </w:p>
+        </w:tc>
+        <w:tc>
+          <w:tcPr/>
+          <w:p>
+            <w:pPr>
+              <w:pStyle w:val="Compact"/>
+            </w:pPr>
+            <w:r>
+              <w:t xml:space="preserve">Network boundaries</w:t>
+            </w:r>
+          </w:p>
+        </w:tc>
+      </w:tr>
+      <w:tr>
+        <w:tc>
+          <w:tcPr/>
+          <w:p>
+            <w:pPr>
+              <w:pStyle w:val="Compact"/>
+            </w:pPr>
+            <w:r>
+              <w:t xml:space="preserve">Orange λ</w:t>
+            </w:r>
+          </w:p>
+        </w:tc>
+        <w:tc>
+          <w:tcPr/>
+          <w:p>
+            <w:pPr>
+              <w:pStyle w:val="Compact"/>
+            </w:pPr>
+            <w:r>
+              <w:rPr>
+                <w:b/>
+                <w:bCs/>
+              </w:rPr>
+              <w:t xml:space="preserve">Lambda</w:t>
+            </w:r>
+          </w:p>
+        </w:tc>
+        <w:tc>
+          <w:tcPr/>
+          <w:p>
+            <w:pPr>
+              <w:pStyle w:val="Compact"/>
+            </w:pPr>
+            <w:r>
+              <w:t xml:space="preserve">Weekday EC2/RDS schedule</w:t>
+            </w:r>
+          </w:p>
+        </w:tc>
+      </w:tr>
+      <w:tr>
+        <w:tc>
+          <w:tcPr/>
+          <w:p>
+            <w:pPr>
+              <w:pStyle w:val="Compact"/>
+            </w:pPr>
+            <w:r>
+              <w:t xml:space="preserve">Pink bus</w:t>
+            </w:r>
+          </w:p>
+        </w:tc>
+        <w:tc>
+          <w:tcPr/>
+          <w:p>
+            <w:pPr>
+              <w:pStyle w:val="Compact"/>
+            </w:pPr>
+            <w:r>
+              <w:rPr>
+                <w:b/>
+                <w:bCs/>
+              </w:rPr>
+              <w:t xml:space="preserve">EventBridge</w:t>
+            </w:r>
+          </w:p>
+        </w:tc>
+        <w:tc>
+          <w:tcPr/>
+          <w:p>
+            <w:pPr>
+              <w:pStyle w:val="Compact"/>
+            </w:pPr>
+            <w:r>
+              <w:t xml:space="preserve">Mon–Fri 10:00 / 19:30 IST + weekend force-stop</w:t>
+            </w:r>
+          </w:p>
+        </w:tc>
+      </w:tr>
+    </w:tbl>
+    <w:p>
+      <w:pPr>
+        <w:pStyle w:val="BodyText"/>
+      </w:pPr>
+      <w:r>
+        <w:rPr>
+          <w:b/>
+          <w:bCs/>
+        </w:rPr>
+        <w:t xml:space="preserve">Raster exports</w:t>
+      </w:r>
+      <w:r>
+        <w:t xml:space="preserve"> </w:t>
+      </w:r>
+      <w:r>
+        <w:t xml:space="preserve">(</w:t>
+      </w:r>
+      <w:r>
+        <w:rPr>
+          <w:rStyle w:val="VerbatimChar"/>
+        </w:rPr>
+        <w:t xml:space="preserve">*.png</w:t>
+      </w:r>
+      <w:r>
+        <w:t xml:space="preserve">,</w:t>
+      </w:r>
+      <w:r>
+        <w:t xml:space="preserve"> </w:t>
+      </w:r>
+      <w:r>
+        <w:rPr>
+          <w:rStyle w:val="VerbatimChar"/>
+        </w:rPr>
+        <w:t xml:space="preserve">*.pdf</w:t>
+      </w:r>
+      <w:r>
+        <w:t xml:space="preserve">,</w:t>
+      </w:r>
+      <w:r>
+        <w:t xml:space="preserve"> </w:t>
+      </w:r>
+      <w:r>
+        <w:rPr>
+          <w:rStyle w:val="VerbatimChar"/>
+        </w:rPr>
+        <w:t xml:space="preserve">*.jpg</w:t>
+      </w:r>
+      <w:r>
+        <w:t xml:space="preserve"> </w:t>
+      </w:r>
+      <w:r>
+        <w:t xml:space="preserve">in this folder) may lag the</w:t>
+      </w:r>
+      <w:r>
+        <w:t xml:space="preserve"> </w:t>
+      </w:r>
+      <w:r>
+        <w:rPr>
           <w:rStyle w:val="VerbatimChar"/>
         </w:rPr>
         <w:t xml:space="preserve">.drawio</w:t>
@@ -9657,11 +10624,24 @@
         <w:t xml:space="preserve"> </w:t>
       </w:r>
       <w:r>
-        <w:t xml:space="preserve">files at https://app.diagrams.net or in VS Code with the Draw.io extension.</w:t>
-      </w:r>
-    </w:p>
-    <w:bookmarkEnd w:id="61"/>
-    <w:bookmarkStart w:id="63" w:name="regenerate-wordpdf-exports"/>
+        <w:t xml:space="preserve">source. After editing a diagram, re-export from diagrams.net:</w:t>
+      </w:r>
+      <w:r>
+        <w:t xml:space="preserve"> </w:t>
+      </w:r>
+      <w:r>
+        <w:rPr>
+          <w:b/>
+          <w:bCs/>
+        </w:rPr>
+        <w:t xml:space="preserve">File → Export as → PNG / PDF</w:t>
+      </w:r>
+      <w:r>
+        <w:t xml:space="preserve">.</w:t>
+      </w:r>
+    </w:p>
+    <w:bookmarkEnd w:id="63"/>
+    <w:bookmarkStart w:id="65" w:name="regenerate-wordpdf-exports"/>
     <w:p>
       <w:pPr>
         <w:pStyle w:val="Heading3"/>
@@ -9680,7 +10660,7 @@
       <w:r>
         <w:t xml:space="preserve"> </w:t>
       </w:r>
-      <w:hyperlink r:id="rId62">
+      <w:hyperlink r:id="rId64">
         <w:r>
           <w:rPr>
             <w:rStyle w:val="Hyperlink"/>
@@ -9698,6 +10678,15 @@
       </w:pPr>
       <w:r>
         <w:rPr>
+          <w:rStyle w:val="CommentTok"/>
+        </w:rPr>
+        <w:t xml:space="preserve"># Word</w:t>
+      </w:r>
+      <w:r>
+        <w:br/>
+      </w:r>
+      <w:r>
+        <w:rPr>
           <w:rStyle w:val="ExtensionTok"/>
         </w:rPr>
         <w:t xml:space="preserve">pandoc</w:t>
@@ -9718,12 +10707,42 @@
         <w:rPr>
           <w:rStyle w:val="NormalTok"/>
         </w:rPr>
-        <w:t xml:space="preserve"> docs/ARCHITECTURE.docx</w:t>
+        <w:t xml:space="preserve"> docs/ARCHITECTURE.docx </w:t>
+      </w:r>
+      <w:r>
+        <w:rPr>
+          <w:rStyle w:val="AttributeTok"/>
+        </w:rPr>
+        <w:t xml:space="preserve">--from</w:t>
+      </w:r>
+      <w:r>
+        <w:rPr>
+          <w:rStyle w:val="NormalTok"/>
+        </w:rPr>
+        <w:t xml:space="preserve"> markdown </w:t>
+      </w:r>
+      <w:r>
+        <w:rPr>
+          <w:rStyle w:val="AttributeTok"/>
+        </w:rPr>
+        <w:t xml:space="preserve">--toc</w:t>
       </w:r>
       <w:r>
         <w:br/>
       </w:r>
       <w:r>
+        <w:br/>
+      </w:r>
+      <w:r>
+        <w:rPr>
+          <w:rStyle w:val="CommentTok"/>
+        </w:rPr>
+        <w:t xml:space="preserve"># HTML (intermediate)</w:t>
+      </w:r>
+      <w:r>
+        <w:br/>
+      </w:r>
+      <w:r>
         <w:rPr>
           <w:rStyle w:val="ExtensionTok"/>
         </w:rPr>
@@ -9745,11 +10764,197 @@
         <w:rPr>
           <w:rStyle w:val="NormalTok"/>
         </w:rPr>
-        <w:t xml:space="preserve"> docs/ARCHITECTURE.pdf</w:t>
-      </w:r>
-    </w:p>
-    <w:bookmarkEnd w:id="63"/>
-    <w:bookmarkStart w:id="64" w:name="source-references"/>
+        <w:t xml:space="preserve"> docs/ARCHITECTURE.html </w:t>
+      </w:r>
+      <w:r>
+        <w:rPr>
+          <w:rStyle w:val="AttributeTok"/>
+        </w:rPr>
+        <w:t xml:space="preserve">--standalone</w:t>
+      </w:r>
+      <w:r>
+        <w:rPr>
+          <w:rStyle w:val="NormalTok"/>
+        </w:rPr>
+        <w:t xml:space="preserve"> </w:t>
+      </w:r>
+      <w:r>
+        <w:rPr>
+          <w:rStyle w:val="AttributeTok"/>
+        </w:rPr>
+        <w:t xml:space="preserve">--toc</w:t>
+      </w:r>
+      <w:r>
+        <w:rPr>
+          <w:rStyle w:val="NormalTok"/>
+        </w:rPr>
+        <w:t xml:space="preserve"> </w:t>
+      </w:r>
+      <w:r>
+        <w:rPr>
+          <w:rStyle w:val="DataTypeTok"/>
+        </w:rPr>
+        <w:t xml:space="preserve">\</w:t>
+      </w:r>
+      <w:r>
+        <w:br/>
+      </w:r>
+      <w:r>
+        <w:rPr>
+          <w:rStyle w:val="NormalTok"/>
+        </w:rPr>
+        <w:t xml:space="preserve">  </w:t>
+      </w:r>
+      <w:r>
+        <w:rPr>
+          <w:rStyle w:val="AttributeTok"/>
+        </w:rPr>
+        <w:t xml:space="preserve">--metadata</w:t>
+      </w:r>
+      <w:r>
+        <w:rPr>
+          <w:rStyle w:val="NormalTok"/>
+        </w:rPr>
+        <w:t xml:space="preserve"> title=</w:t>
+      </w:r>
+      <w:r>
+        <w:rPr>
+          <w:rStyle w:val="StringTok"/>
+        </w:rPr>
+        <w:t xml:space="preserve">"InterviewCoach AI Architecture"</w:t>
+      </w:r>
+      <w:r>
+        <w:br/>
+      </w:r>
+      <w:r>
+        <w:br/>
+      </w:r>
+      <w:r>
+        <w:rPr>
+          <w:rStyle w:val="CommentTok"/>
+        </w:rPr>
+        <w:t xml:space="preserve"># PDF (via headless Chrome on macOS)</w:t>
+      </w:r>
+      <w:r>
+        <w:br/>
+      </w:r>
+      <w:r>
+        <w:rPr>
+          <w:rStyle w:val="StringTok"/>
+        </w:rPr>
+        <w:t xml:space="preserve">"/Applications/Google Chrome.app/Contents/MacOS/Google Chrome"</w:t>
+      </w:r>
+      <w:r>
+        <w:rPr>
+          <w:rStyle w:val="NormalTok"/>
+        </w:rPr>
+        <w:t xml:space="preserve"> </w:t>
+      </w:r>
+      <w:r>
+        <w:rPr>
+          <w:rStyle w:val="DataTypeTok"/>
+        </w:rPr>
+        <w:t xml:space="preserve">\</w:t>
+      </w:r>
+      <w:r>
+        <w:br/>
+      </w:r>
+      <w:r>
+        <w:rPr>
+          <w:rStyle w:val="NormalTok"/>
+        </w:rPr>
+        <w:t xml:space="preserve">  </w:t>
+      </w:r>
+      <w:r>
+        <w:rPr>
+          <w:rStyle w:val="AttributeTok"/>
+        </w:rPr>
+        <w:t xml:space="preserve">--headless</w:t>
+      </w:r>
+      <w:r>
+        <w:rPr>
+          <w:rStyle w:val="NormalTok"/>
+        </w:rPr>
+        <w:t xml:space="preserve"> </w:t>
+      </w:r>
+      <w:r>
+        <w:rPr>
+          <w:rStyle w:val="AttributeTok"/>
+        </w:rPr>
+        <w:t xml:space="preserve">--disable-gpu</w:t>
+      </w:r>
+      <w:r>
+        <w:rPr>
+          <w:rStyle w:val="NormalTok"/>
+        </w:rPr>
+        <w:t xml:space="preserve"> </w:t>
+      </w:r>
+      <w:r>
+        <w:rPr>
+          <w:rStyle w:val="AttributeTok"/>
+        </w:rPr>
+        <w:t xml:space="preserve">--print-to-pdf</w:t>
+      </w:r>
+      <w:r>
+        <w:rPr>
+          <w:rStyle w:val="OperatorTok"/>
+        </w:rPr>
+        <w:t xml:space="preserve">=</w:t>
+      </w:r>
+      <w:r>
+        <w:rPr>
+          <w:rStyle w:val="NormalTok"/>
+        </w:rPr>
+        <w:t xml:space="preserve">docs/ARCHITECTURE.pdf </w:t>
+      </w:r>
+      <w:r>
+        <w:rPr>
+          <w:rStyle w:val="DataTypeTok"/>
+        </w:rPr>
+        <w:t xml:space="preserve">\</w:t>
+      </w:r>
+      <w:r>
+        <w:br/>
+      </w:r>
+      <w:r>
+        <w:rPr>
+          <w:rStyle w:val="NormalTok"/>
+        </w:rPr>
+        <w:t xml:space="preserve">  </w:t>
+      </w:r>
+      <w:r>
+        <w:rPr>
+          <w:rStyle w:val="StringTok"/>
+        </w:rPr>
+        <w:t xml:space="preserve">"file://</w:t>
+      </w:r>
+      <w:r>
+        <w:rPr>
+          <w:rStyle w:val="VariableTok"/>
+        </w:rPr>
+        <w:t xml:space="preserve">$(</w:t>
+      </w:r>
+      <w:r>
+        <w:rPr>
+          <w:rStyle w:val="BuiltInTok"/>
+        </w:rPr>
+        <w:t xml:space="preserve">pwd</w:t>
+      </w:r>
+      <w:r>
+        <w:rPr>
+          <w:rStyle w:val="VariableTok"/>
+        </w:rPr>
+        <w:t xml:space="preserve">)</w:t>
+      </w:r>
+      <w:r>
+        <w:rPr>
+          <w:rStyle w:val="StringTok"/>
+        </w:rPr>
+        <w:t xml:space="preserve">/docs/ARCHITECTURE.html"</w:t>
+      </w:r>
+    </w:p>
+    <w:bookmarkEnd w:id="65"/>
+    <w:bookmarkStart w:id="66" w:name="source-references"/>
     <w:p>
       <w:pPr>
         <w:pStyle w:val="Heading3"/>
@@ -9978,9 +11183,9 @@
         <w:t xml:space="preserve">Document maintained by the InterviewCoach engineering team.</w:t>
       </w:r>
     </w:p>
-    <w:bookmarkEnd w:id="64"/>
-    <w:bookmarkEnd w:id="65"/>
     <w:bookmarkEnd w:id="66"/>
+    <w:bookmarkEnd w:id="67"/>
+    <w:bookmarkEnd w:id="68"/>
     <w:sectPr>
       <w:footnotePr>
         <w:numRestart w:val="eachSect"/>
@@ -10382,6 +11587,36 @@
     <w:abstractNumId w:val="991"/>
   </w:num>
   <w:num w:numId="1007">
+    <w:abstractNumId w:val="99411"/>
+    <w:lvlOverride w:ilvl="0">
+      <w:startOverride w:val="1"/>
+    </w:lvlOverride>
+    <w:lvlOverride w:ilvl="1">
+      <w:startOverride w:val="1"/>
+    </w:lvlOverride>
+    <w:lvlOverride w:ilvl="2">
+      <w:startOverride w:val="1"/>
+    </w:lvlOverride>
+    <w:lvlOverride w:ilvl="3">
+      <w:startOverride w:val="1"/>
+    </w:lvlOverride>
+    <w:lvlOverride w:ilvl="4">
+      <w:startOverride w:val="1"/>
+    </w:lvlOverride>
+    <w:lvlOverride w:ilvl="5">
+      <w:startOverride w:val="1"/>
+    </w:lvlOverride>
+    <w:lvlOverride w:ilvl="6">
+      <w:startOverride w:val="1"/>
+    </w:lvlOverride>
+    <w:lvlOverride w:ilvl="7">
+      <w:startOverride w:val="1"/>
+    </w:lvlOverride>
+    <w:lvlOverride w:ilvl="8">
+      <w:startOverride w:val="1"/>
+    </w:lvlOverride>
+  </w:num>
+  <w:num w:numId="1008">
     <w:abstractNumId w:val="99411"/>
     <w:lvlOverride w:ilvl="0">
       <w:startOverride w:val="1"/>

</xml_diff>